<commit_message>
Fix dashes: replace en dashes with em dashes throughout
https://claude.ai/code/session_01GschpaVe6voG6o2AvmN7tU
</commit_message>
<xml_diff>
--- a/knoah-package-comparison.docx
+++ b/knoah-package-comparison.docx
@@ -17,7 +17,7 @@
         <w:pStyle w:val="Heading3"/>
       </w:pPr>
       <w:r>
-        <w:t xml:space="preserve">Global Launch Sprint · 60-Day Window · June–August 2026</w:t>
+        <w:t xml:space="preserve">Global Launch Sprint · 60-Day Window · June—August 2026</w:t>
       </w:r>
     </w:p>
     <w:p>
@@ -637,31 +637,31 @@
               <w:jc w:val="center"/>
             </w:pPr>
             <w:r>
-              <w:t xml:space="preserve">50K – 200K</w:t>
-            </w:r>
-          </w:p>
-        </w:tc>
-        <w:tc>
-          <w:tcPr/>
-          <w:p>
-            <w:pPr>
-              <w:pStyle w:val="Compact"/>
-              <w:jc w:val="center"/>
-            </w:pPr>
-            <w:r>
-              <w:t xml:space="preserve">50K – 500K</w:t>
-            </w:r>
-          </w:p>
-        </w:tc>
-        <w:tc>
-          <w:tcPr/>
-          <w:p>
-            <w:pPr>
-              <w:pStyle w:val="Compact"/>
-              <w:jc w:val="center"/>
-            </w:pPr>
-            <w:r>
-              <w:t xml:space="preserve">200K – 1M</w:t>
+              <w:t xml:space="preserve">50K — 200K</w:t>
+            </w:r>
+          </w:p>
+        </w:tc>
+        <w:tc>
+          <w:tcPr/>
+          <w:p>
+            <w:pPr>
+              <w:pStyle w:val="Compact"/>
+              <w:jc w:val="center"/>
+            </w:pPr>
+            <w:r>
+              <w:t xml:space="preserve">50K — 500K</w:t>
+            </w:r>
+          </w:p>
+        </w:tc>
+        <w:tc>
+          <w:tcPr/>
+          <w:p>
+            <w:pPr>
+              <w:pStyle w:val="Compact"/>
+              <w:jc w:val="center"/>
+            </w:pPr>
+            <w:r>
+              <w:t xml:space="preserve">200K — 1M</w:t>
             </w:r>
           </w:p>
         </w:tc>
@@ -687,31 +687,31 @@
               <w:jc w:val="center"/>
             </w:pPr>
             <w:r>
-              <w:t xml:space="preserve">4–6</w:t>
-            </w:r>
-          </w:p>
-        </w:tc>
-        <w:tc>
-          <w:tcPr/>
-          <w:p>
-            <w:pPr>
-              <w:pStyle w:val="Compact"/>
-              <w:jc w:val="center"/>
-            </w:pPr>
-            <w:r>
-              <w:t xml:space="preserve">6–10</w:t>
-            </w:r>
-          </w:p>
-        </w:tc>
-        <w:tc>
-          <w:tcPr/>
-          <w:p>
-            <w:pPr>
-              <w:pStyle w:val="Compact"/>
-              <w:jc w:val="center"/>
-            </w:pPr>
-            <w:r>
-              <w:t xml:space="preserve">10–12</w:t>
+              <w:t xml:space="preserve">4—6</w:t>
+            </w:r>
+          </w:p>
+        </w:tc>
+        <w:tc>
+          <w:tcPr/>
+          <w:p>
+            <w:pPr>
+              <w:pStyle w:val="Compact"/>
+              <w:jc w:val="center"/>
+            </w:pPr>
+            <w:r>
+              <w:t xml:space="preserve">6—10</w:t>
+            </w:r>
+          </w:p>
+        </w:tc>
+        <w:tc>
+          <w:tcPr/>
+          <w:p>
+            <w:pPr>
+              <w:pStyle w:val="Compact"/>
+              <w:jc w:val="center"/>
+            </w:pPr>
+            <w:r>
+              <w:t xml:space="preserve">10—12</w:t>
             </w:r>
           </w:p>
         </w:tc>
@@ -737,31 +737,31 @@
               <w:jc w:val="center"/>
             </w:pPr>
             <w:r>
-              <w:t xml:space="preserve">8–12</w:t>
-            </w:r>
-          </w:p>
-        </w:tc>
-        <w:tc>
-          <w:tcPr/>
-          <w:p>
-            <w:pPr>
-              <w:pStyle w:val="Compact"/>
-              <w:jc w:val="center"/>
-            </w:pPr>
-            <w:r>
-              <w:t xml:space="preserve">24–40</w:t>
-            </w:r>
-          </w:p>
-        </w:tc>
-        <w:tc>
-          <w:tcPr/>
-          <w:p>
-            <w:pPr>
-              <w:pStyle w:val="Compact"/>
-              <w:jc w:val="center"/>
-            </w:pPr>
-            <w:r>
-              <w:t xml:space="preserve">40–48</w:t>
+              <w:t xml:space="preserve">8—12</w:t>
+            </w:r>
+          </w:p>
+        </w:tc>
+        <w:tc>
+          <w:tcPr/>
+          <w:p>
+            <w:pPr>
+              <w:pStyle w:val="Compact"/>
+              <w:jc w:val="center"/>
+            </w:pPr>
+            <w:r>
+              <w:t xml:space="preserve">24—40</w:t>
+            </w:r>
+          </w:p>
+        </w:tc>
+        <w:tc>
+          <w:tcPr/>
+          <w:p>
+            <w:pPr>
+              <w:pStyle w:val="Compact"/>
+              <w:jc w:val="center"/>
+            </w:pPr>
+            <w:r>
+              <w:t xml:space="preserve">40—48</w:t>
             </w:r>
           </w:p>
         </w:tc>
@@ -1558,19 +1558,19 @@
               <w:jc w:val="center"/>
             </w:pPr>
             <w:r>
-              <w:t xml:space="preserve">$2K–3K / market</w:t>
-            </w:r>
-          </w:p>
-        </w:tc>
-        <w:tc>
-          <w:tcPr/>
-          <w:p>
-            <w:pPr>
-              <w:pStyle w:val="Compact"/>
-              <w:jc w:val="center"/>
-            </w:pPr>
-            <w:r>
-              <w:t xml:space="preserve">$5K–8K / market</w:t>
+              <w:t xml:space="preserve">$2K—3K / market</w:t>
+            </w:r>
+          </w:p>
+        </w:tc>
+        <w:tc>
+          <w:tcPr/>
+          <w:p>
+            <w:pPr>
+              <w:pStyle w:val="Compact"/>
+              <w:jc w:val="center"/>
+            </w:pPr>
+            <w:r>
+              <w:t xml:space="preserve">$5K—8K / market</w:t>
             </w:r>
           </w:p>
         </w:tc>
@@ -2267,31 +2267,31 @@
               <w:jc w:val="center"/>
             </w:pPr>
             <w:r>
-              <w:t xml:space="preserve">1K – 3K</w:t>
-            </w:r>
-          </w:p>
-        </w:tc>
-        <w:tc>
-          <w:tcPr/>
-          <w:p>
-            <w:pPr>
-              <w:pStyle w:val="Compact"/>
-              <w:jc w:val="center"/>
-            </w:pPr>
-            <w:r>
-              <w:t xml:space="preserve">8K – 20K</w:t>
-            </w:r>
-          </w:p>
-        </w:tc>
-        <w:tc>
-          <w:tcPr/>
-          <w:p>
-            <w:pPr>
-              <w:pStyle w:val="Compact"/>
-              <w:jc w:val="center"/>
-            </w:pPr>
-            <w:r>
-              <w:t xml:space="preserve">30K – 60K</w:t>
+              <w:t xml:space="preserve">1K — 3K</w:t>
+            </w:r>
+          </w:p>
+        </w:tc>
+        <w:tc>
+          <w:tcPr/>
+          <w:p>
+            <w:pPr>
+              <w:pStyle w:val="Compact"/>
+              <w:jc w:val="center"/>
+            </w:pPr>
+            <w:r>
+              <w:t xml:space="preserve">8K — 20K</w:t>
+            </w:r>
+          </w:p>
+        </w:tc>
+        <w:tc>
+          <w:tcPr/>
+          <w:p>
+            <w:pPr>
+              <w:pStyle w:val="Compact"/>
+              <w:jc w:val="center"/>
+            </w:pPr>
+            <w:r>
+              <w:t xml:space="preserve">30K — 60K</w:t>
             </w:r>
           </w:p>
         </w:tc>
@@ -2317,7 +2317,7 @@
               <w:jc w:val="center"/>
             </w:pPr>
             <w:r>
-              <w:t xml:space="preserve">2K – 5K</w:t>
+              <w:t xml:space="preserve">2K — 5K</w:t>
             </w:r>
           </w:p>
         </w:tc>
@@ -2471,31 +2471,31 @@
               <w:jc w:val="center"/>
             </w:pPr>
             <w:r>
-              <w:t xml:space="preserve">$16–48</w:t>
-            </w:r>
-          </w:p>
-        </w:tc>
-        <w:tc>
-          <w:tcPr/>
-          <w:p>
-            <w:pPr>
-              <w:pStyle w:val="Compact"/>
-              <w:jc w:val="center"/>
-            </w:pPr>
-            <w:r>
-              <w:t xml:space="preserve">$4.4–11</w:t>
-            </w:r>
-          </w:p>
-        </w:tc>
-        <w:tc>
-          <w:tcPr/>
-          <w:p>
-            <w:pPr>
-              <w:pStyle w:val="Compact"/>
-              <w:jc w:val="center"/>
-            </w:pPr>
-            <w:r>
-              <w:t xml:space="preserve">$3–6</w:t>
+              <w:t xml:space="preserve">$16—48</w:t>
+            </w:r>
+          </w:p>
+        </w:tc>
+        <w:tc>
+          <w:tcPr/>
+          <w:p>
+            <w:pPr>
+              <w:pStyle w:val="Compact"/>
+              <w:jc w:val="center"/>
+            </w:pPr>
+            <w:r>
+              <w:t xml:space="preserve">$4.4—11</w:t>
+            </w:r>
+          </w:p>
+        </w:tc>
+        <w:tc>
+          <w:tcPr/>
+          <w:p>
+            <w:pPr>
+              <w:pStyle w:val="Compact"/>
+              <w:jc w:val="center"/>
+            </w:pPr>
+            <w:r>
+              <w:t xml:space="preserve">$3—6</w:t>
             </w:r>
           </w:p>
         </w:tc>
@@ -3186,7 +3186,7 @@
         <w:rPr>
           <w:rStyle w:val="VerbatimChar"/>
         </w:rPr>
-        <w:t xml:space="preserve">Weeks 6–8  ·  Investment-announcement amplification blast (Growth: coordinated · Full Scale: 20+ outlets)</w:t>
+        <w:t xml:space="preserve">Weeks 6—8  ·  Investment-announcement amplification blast (Growth: coordinated · Full Scale: 20+ outlets)</w:t>
       </w:r>
       <w:r>
         <w:br/>

</xml_diff>